<commit_message>
Improve legal text handling and document formatting
Fixes line break issues in the legal text memo box and generates cleaner, copy-paste-friendly Word documents for terms and conditions.

Replit-Commit-Author: Agent
Replit-Commit-Session-Id: f2b806a9-f819-495a-b4cc-8ebf7a17ca6a
Replit-Commit-Checkpoint-Type: full_checkpoint
Replit-Commit-Event-Id: 001e3b7c-66eb-4f70-b96b-08d3e5789708
Replit-Commit-Screenshot-Url: https://storage.googleapis.com/screenshot-production-us-central1/cc5d55ed-daab-4664-aeed-b138b47daea8/f2b806a9-f819-495a-b4cc-8ebf7a17ca6a/qgh1te0
Replit-Helium-Checkpoint-Created: true
</commit_message>
<xml_diff>
--- a/attached_assets/terms_conditions_ar_2026-04-30.docx
+++ b/attached_assets/terms_conditions_ar_2026-04-30.docx
@@ -2,24 +2,6 @@
 <file path=word/document.xml><?xml version="1.0" encoding="utf-8"?>
 <w:document xmlns:wpc="http://schemas.microsoft.com/office/word/2010/wordprocessingCanvas" xmlns:mo="http://schemas.microsoft.com/office/mac/office/2008/main" xmlns:mc="http://schemas.openxmlformats.org/markup-compatibility/2006" xmlns:mv="urn:schemas-microsoft-com:mac:vml" xmlns:o="urn:schemas-microsoft-com:office:office" xmlns:r="http://schemas.openxmlformats.org/officeDocument/2006/relationships" xmlns:m="http://schemas.openxmlformats.org/officeDocument/2006/math" xmlns:v="urn:schemas-microsoft-com:vml" xmlns:wp14="http://schemas.microsoft.com/office/word/2010/wordprocessingDrawing" xmlns:wp="http://schemas.openxmlformats.org/drawingml/2006/wordprocessingDrawing" xmlns:w10="urn:schemas-microsoft-com:office:word" xmlns:w="http://schemas.openxmlformats.org/wordprocessingml/2006/main" xmlns:w14="http://schemas.microsoft.com/office/word/2010/wordml" xmlns:wpg="http://schemas.microsoft.com/office/word/2010/wordprocessingGroup" xmlns:wpi="http://schemas.microsoft.com/office/word/2010/wordprocessingInk" xmlns:wne="http://schemas.microsoft.com/office/word/2006/wordml" xmlns:wps="http://schemas.microsoft.com/office/word/2010/wordprocessingShape" mc:Ignorable="w14 wp14">
   <w:body>
-    <w:p>
-      <w:pPr>
-        <w:spacing w:before="0" w:after="200" w:line="336" w:lineRule="auto"/>
-        <w:jc w:val="center"/>
-        <w:bidi w:val="1"/>
-      </w:pPr>
-      <w:r>
-        <w:rPr>
-          <w:rFonts w:ascii="Cairo" w:hAnsi="Cairo" w:cs="Cairo" w:eastAsia="Tahoma"/>
-          <w:b/>
-          <w:color w:val="111827"/>
-          <w:sz w:val="44"/>
-          <w:rtl w:val="1"/>
-          <w:szCs w:val="44"/>
-        </w:rPr>
-        <w:t>الشروط والأحكام</w:t>
-      </w:r>
-    </w:p>
     <w:p>
       <w:pPr>
         <w:spacing w:before="0" w:after="80" w:line="336" w:lineRule="auto"/>
@@ -30,53 +12,83 @@
         <w:rPr>
           <w:rFonts w:ascii="Cairo" w:hAnsi="Cairo" w:cs="Cairo" w:eastAsia="Tahoma"/>
           <w:b/>
-          <w:color w:val="4B5563"/>
-          <w:sz w:val="24"/>
+          <w:color w:val="000000"/>
+          <w:sz w:val="36"/>
           <w:rtl w:val="1"/>
-          <w:szCs w:val="24"/>
+          <w:szCs w:val="36"/>
+        </w:rPr>
+        <w:t>الشروط والأحكام</w:t>
+      </w:r>
+    </w:p>
+    <w:p>
+      <w:pPr>
+        <w:bidi w:val="1"/>
+        <w:spacing w:after="0" w:before="0"/>
+      </w:pPr>
+    </w:p>
+    <w:p>
+      <w:pPr>
+        <w:spacing w:before="0" w:after="40" w:line="336" w:lineRule="auto"/>
+        <w:jc w:val="center"/>
+        <w:bidi w:val="1"/>
+      </w:pPr>
+      <w:r>
+        <w:rPr>
+          <w:rFonts w:ascii="Cairo" w:hAnsi="Cairo" w:cs="Cairo" w:eastAsia="Tahoma"/>
+          <w:b w:val="0"/>
+          <w:color w:val="000000"/>
+          <w:sz w:val="22"/>
+          <w:rtl w:val="1"/>
+          <w:szCs w:val="22"/>
         </w:rPr>
         <w:t>شركة العربة الفاخرة (Luxury Cart Company)</w:t>
       </w:r>
     </w:p>
     <w:p>
       <w:pPr>
-        <w:spacing w:before="0" w:after="80" w:line="336" w:lineRule="auto"/>
+        <w:spacing w:before="0" w:after="40" w:line="336" w:lineRule="auto"/>
         <w:jc w:val="center"/>
         <w:bidi w:val="1"/>
       </w:pPr>
       <w:r>
         <w:rPr>
           <w:rFonts w:ascii="Cairo" w:hAnsi="Cairo" w:cs="Cairo" w:eastAsia="Tahoma"/>
-          <w:b/>
-          <w:color w:val="4B5563"/>
-          <w:sz w:val="24"/>
+          <w:b w:val="0"/>
+          <w:color w:val="000000"/>
+          <w:sz w:val="22"/>
           <w:rtl w:val="1"/>
-          <w:szCs w:val="24"/>
+          <w:szCs w:val="22"/>
         </w:rPr>
         <w:t>منصة  وورك فورس/WORKFORCE</w:t>
       </w:r>
     </w:p>
     <w:p>
       <w:pPr>
-        <w:spacing w:before="0" w:after="80" w:line="336" w:lineRule="auto"/>
+        <w:spacing w:before="0" w:after="40" w:line="336" w:lineRule="auto"/>
         <w:jc w:val="center"/>
         <w:bidi w:val="1"/>
       </w:pPr>
       <w:r>
         <w:rPr>
           <w:rFonts w:ascii="Cairo" w:hAnsi="Cairo" w:cs="Cairo" w:eastAsia="Tahoma"/>
-          <w:b/>
-          <w:color w:val="4B5563"/>
-          <w:sz w:val="24"/>
+          <w:b w:val="0"/>
+          <w:color w:val="000000"/>
+          <w:sz w:val="22"/>
           <w:rtl w:val="1"/>
-          <w:szCs w:val="24"/>
+          <w:szCs w:val="22"/>
         </w:rPr>
         <w:t>تاريخ السريان: 30 أبريل 2026</w:t>
       </w:r>
     </w:p>
     <w:p>
       <w:pPr>
-        <w:spacing w:before="280" w:after="80" w:line="336" w:lineRule="auto"/>
+        <w:bidi w:val="1"/>
+        <w:spacing w:after="0" w:before="0"/>
+      </w:pPr>
+    </w:p>
+    <w:p>
+      <w:pPr>
+        <w:spacing w:before="160" w:after="80" w:line="336" w:lineRule="auto"/>
         <w:jc w:val="right"/>
         <w:bidi w:val="1"/>
       </w:pPr>
@@ -84,10 +96,10 @@
         <w:rPr>
           <w:rFonts w:ascii="Cairo" w:hAnsi="Cairo" w:cs="Cairo" w:eastAsia="Tahoma"/>
           <w:b/>
-          <w:color w:val="16366F"/>
-          <w:sz w:val="28"/>
+          <w:color w:val="000000"/>
+          <w:sz w:val="26"/>
           <w:rtl w:val="1"/>
-          <w:szCs w:val="28"/>
+          <w:szCs w:val="26"/>
         </w:rPr>
         <w:t>1. قبول الشروط</w:t>
       </w:r>
@@ -102,6 +114,7 @@
         <w:rPr>
           <w:rFonts w:ascii="Cairo" w:hAnsi="Cairo" w:cs="Cairo" w:eastAsia="Tahoma"/>
           <w:b w:val="0"/>
+          <w:color w:val="000000"/>
           <w:sz w:val="22"/>
           <w:rtl w:val="1"/>
           <w:szCs w:val="22"/>
@@ -111,7 +124,13 @@
     </w:p>
     <w:p>
       <w:pPr>
-        <w:spacing w:before="280" w:after="80" w:line="336" w:lineRule="auto"/>
+        <w:bidi w:val="1"/>
+        <w:spacing w:after="0" w:before="0"/>
+      </w:pPr>
+    </w:p>
+    <w:p>
+      <w:pPr>
+        <w:spacing w:before="160" w:after="80" w:line="336" w:lineRule="auto"/>
         <w:jc w:val="right"/>
         <w:bidi w:val="1"/>
       </w:pPr>
@@ -119,10 +138,10 @@
         <w:rPr>
           <w:rFonts w:ascii="Cairo" w:hAnsi="Cairo" w:cs="Cairo" w:eastAsia="Tahoma"/>
           <w:b/>
-          <w:color w:val="16366F"/>
-          <w:sz w:val="28"/>
+          <w:color w:val="000000"/>
+          <w:sz w:val="26"/>
           <w:rtl w:val="1"/>
-          <w:szCs w:val="28"/>
+          <w:szCs w:val="26"/>
         </w:rPr>
         <w:t>2. تعريفات</w:t>
       </w:r>
@@ -141,6 +160,7 @@
         <w:rPr>
           <w:rFonts w:ascii="Cairo" w:hAnsi="Cairo" w:cs="Cairo" w:eastAsia="Tahoma"/>
           <w:b w:val="0"/>
+          <w:color w:val="000000"/>
           <w:sz w:val="22"/>
           <w:rtl w:val="1"/>
           <w:szCs w:val="22"/>
@@ -162,6 +182,7 @@
         <w:rPr>
           <w:rFonts w:ascii="Cairo" w:hAnsi="Cairo" w:cs="Cairo" w:eastAsia="Tahoma"/>
           <w:b w:val="0"/>
+          <w:color w:val="000000"/>
           <w:sz w:val="22"/>
           <w:rtl w:val="1"/>
           <w:szCs w:val="22"/>
@@ -183,6 +204,7 @@
         <w:rPr>
           <w:rFonts w:ascii="Cairo" w:hAnsi="Cairo" w:cs="Cairo" w:eastAsia="Tahoma"/>
           <w:b w:val="0"/>
+          <w:color w:val="000000"/>
           <w:sz w:val="22"/>
           <w:rtl w:val="1"/>
           <w:szCs w:val="22"/>
@@ -204,6 +226,7 @@
         <w:rPr>
           <w:rFonts w:ascii="Cairo" w:hAnsi="Cairo" w:cs="Cairo" w:eastAsia="Tahoma"/>
           <w:b w:val="0"/>
+          <w:color w:val="000000"/>
           <w:sz w:val="22"/>
           <w:rtl w:val="1"/>
           <w:szCs w:val="22"/>
@@ -225,6 +248,7 @@
         <w:rPr>
           <w:rFonts w:ascii="Cairo" w:hAnsi="Cairo" w:cs="Cairo" w:eastAsia="Tahoma"/>
           <w:b w:val="0"/>
+          <w:color w:val="000000"/>
           <w:sz w:val="22"/>
           <w:rtl w:val="1"/>
           <w:szCs w:val="22"/>
@@ -246,6 +270,7 @@
         <w:rPr>
           <w:rFonts w:ascii="Cairo" w:hAnsi="Cairo" w:cs="Cairo" w:eastAsia="Tahoma"/>
           <w:b w:val="0"/>
+          <w:color w:val="000000"/>
           <w:sz w:val="22"/>
           <w:rtl w:val="1"/>
           <w:szCs w:val="22"/>
@@ -255,7 +280,13 @@
     </w:p>
     <w:p>
       <w:pPr>
-        <w:spacing w:before="280" w:after="80" w:line="336" w:lineRule="auto"/>
+        <w:bidi w:val="1"/>
+        <w:spacing w:after="0" w:before="0"/>
+      </w:pPr>
+    </w:p>
+    <w:p>
+      <w:pPr>
+        <w:spacing w:before="160" w:after="80" w:line="336" w:lineRule="auto"/>
         <w:jc w:val="right"/>
         <w:bidi w:val="1"/>
       </w:pPr>
@@ -263,10 +294,10 @@
         <w:rPr>
           <w:rFonts w:ascii="Cairo" w:hAnsi="Cairo" w:cs="Cairo" w:eastAsia="Tahoma"/>
           <w:b/>
-          <w:color w:val="16366F"/>
-          <w:sz w:val="28"/>
+          <w:color w:val="000000"/>
+          <w:sz w:val="26"/>
           <w:rtl w:val="1"/>
-          <w:szCs w:val="28"/>
+          <w:szCs w:val="26"/>
         </w:rPr>
         <w:t>3. الأهلية</w:t>
       </w:r>
@@ -281,6 +312,7 @@
         <w:rPr>
           <w:rFonts w:ascii="Cairo" w:hAnsi="Cairo" w:cs="Cairo" w:eastAsia="Tahoma"/>
           <w:b w:val="0"/>
+          <w:color w:val="000000"/>
           <w:sz w:val="22"/>
           <w:rtl w:val="1"/>
           <w:szCs w:val="22"/>
@@ -290,7 +322,13 @@
     </w:p>
     <w:p>
       <w:pPr>
-        <w:spacing w:before="280" w:after="80" w:line="336" w:lineRule="auto"/>
+        <w:bidi w:val="1"/>
+        <w:spacing w:after="0" w:before="0"/>
+      </w:pPr>
+    </w:p>
+    <w:p>
+      <w:pPr>
+        <w:spacing w:before="160" w:after="80" w:line="336" w:lineRule="auto"/>
         <w:jc w:val="right"/>
         <w:bidi w:val="1"/>
       </w:pPr>
@@ -298,10 +336,10 @@
         <w:rPr>
           <w:rFonts w:ascii="Cairo" w:hAnsi="Cairo" w:cs="Cairo" w:eastAsia="Tahoma"/>
           <w:b/>
-          <w:color w:val="16366F"/>
-          <w:sz w:val="28"/>
+          <w:color w:val="000000"/>
+          <w:sz w:val="26"/>
           <w:rtl w:val="1"/>
-          <w:szCs w:val="28"/>
+          <w:szCs w:val="26"/>
         </w:rPr>
         <w:t>4. الحسابات والأمن</w:t>
       </w:r>
@@ -320,6 +358,7 @@
         <w:rPr>
           <w:rFonts w:ascii="Cairo" w:hAnsi="Cairo" w:cs="Cairo" w:eastAsia="Tahoma"/>
           <w:b w:val="0"/>
+          <w:color w:val="000000"/>
           <w:sz w:val="22"/>
           <w:rtl w:val="1"/>
           <w:szCs w:val="22"/>
@@ -341,6 +380,7 @@
         <w:rPr>
           <w:rFonts w:ascii="Cairo" w:hAnsi="Cairo" w:cs="Cairo" w:eastAsia="Tahoma"/>
           <w:b w:val="0"/>
+          <w:color w:val="000000"/>
           <w:sz w:val="22"/>
           <w:rtl w:val="1"/>
           <w:szCs w:val="22"/>
@@ -362,6 +402,7 @@
         <w:rPr>
           <w:rFonts w:ascii="Cairo" w:hAnsi="Cairo" w:cs="Cairo" w:eastAsia="Tahoma"/>
           <w:b w:val="0"/>
+          <w:color w:val="000000"/>
           <w:sz w:val="22"/>
           <w:rtl w:val="1"/>
           <w:szCs w:val="22"/>
@@ -383,6 +424,7 @@
         <w:rPr>
           <w:rFonts w:ascii="Cairo" w:hAnsi="Cairo" w:cs="Cairo" w:eastAsia="Tahoma"/>
           <w:b w:val="0"/>
+          <w:color w:val="000000"/>
           <w:sz w:val="22"/>
           <w:rtl w:val="1"/>
           <w:szCs w:val="22"/>
@@ -392,7 +434,13 @@
     </w:p>
     <w:p>
       <w:pPr>
-        <w:spacing w:before="280" w:after="80" w:line="336" w:lineRule="auto"/>
+        <w:bidi w:val="1"/>
+        <w:spacing w:after="0" w:before="0"/>
+      </w:pPr>
+    </w:p>
+    <w:p>
+      <w:pPr>
+        <w:spacing w:before="160" w:after="80" w:line="336" w:lineRule="auto"/>
         <w:jc w:val="right"/>
         <w:bidi w:val="1"/>
       </w:pPr>
@@ -400,10 +448,10 @@
         <w:rPr>
           <w:rFonts w:ascii="Cairo" w:hAnsi="Cairo" w:cs="Cairo" w:eastAsia="Tahoma"/>
           <w:b/>
-          <w:color w:val="16366F"/>
-          <w:sz w:val="28"/>
+          <w:color w:val="000000"/>
+          <w:sz w:val="26"/>
           <w:rtl w:val="1"/>
-          <w:szCs w:val="28"/>
+          <w:szCs w:val="26"/>
         </w:rPr>
         <w:t>5. الاستخدام المقبول</w:t>
       </w:r>
@@ -418,6 +466,7 @@
         <w:rPr>
           <w:rFonts w:ascii="Cairo" w:hAnsi="Cairo" w:cs="Cairo" w:eastAsia="Tahoma"/>
           <w:b w:val="0"/>
+          <w:color w:val="000000"/>
           <w:sz w:val="22"/>
           <w:rtl w:val="1"/>
           <w:szCs w:val="22"/>
@@ -439,6 +488,7 @@
         <w:rPr>
           <w:rFonts w:ascii="Cairo" w:hAnsi="Cairo" w:cs="Cairo" w:eastAsia="Tahoma"/>
           <w:b w:val="0"/>
+          <w:color w:val="000000"/>
           <w:sz w:val="22"/>
           <w:rtl w:val="1"/>
           <w:szCs w:val="22"/>
@@ -460,6 +510,7 @@
         <w:rPr>
           <w:rFonts w:ascii="Cairo" w:hAnsi="Cairo" w:cs="Cairo" w:eastAsia="Tahoma"/>
           <w:b w:val="0"/>
+          <w:color w:val="000000"/>
           <w:sz w:val="22"/>
           <w:rtl w:val="1"/>
           <w:szCs w:val="22"/>
@@ -481,6 +532,7 @@
         <w:rPr>
           <w:rFonts w:ascii="Cairo" w:hAnsi="Cairo" w:cs="Cairo" w:eastAsia="Tahoma"/>
           <w:b w:val="0"/>
+          <w:color w:val="000000"/>
           <w:sz w:val="22"/>
           <w:rtl w:val="1"/>
           <w:szCs w:val="22"/>
@@ -502,6 +554,7 @@
         <w:rPr>
           <w:rFonts w:ascii="Cairo" w:hAnsi="Cairo" w:cs="Cairo" w:eastAsia="Tahoma"/>
           <w:b w:val="0"/>
+          <w:color w:val="000000"/>
           <w:sz w:val="22"/>
           <w:rtl w:val="1"/>
           <w:szCs w:val="22"/>
@@ -523,6 +576,7 @@
         <w:rPr>
           <w:rFonts w:ascii="Cairo" w:hAnsi="Cairo" w:cs="Cairo" w:eastAsia="Tahoma"/>
           <w:b w:val="0"/>
+          <w:color w:val="000000"/>
           <w:sz w:val="22"/>
           <w:rtl w:val="1"/>
           <w:szCs w:val="22"/>
@@ -544,6 +598,7 @@
         <w:rPr>
           <w:rFonts w:ascii="Cairo" w:hAnsi="Cairo" w:cs="Cairo" w:eastAsia="Tahoma"/>
           <w:b w:val="0"/>
+          <w:color w:val="000000"/>
           <w:sz w:val="22"/>
           <w:rtl w:val="1"/>
           <w:szCs w:val="22"/>
@@ -561,6 +616,7 @@
         <w:rPr>
           <w:rFonts w:ascii="Cairo" w:hAnsi="Cairo" w:cs="Cairo" w:eastAsia="Tahoma"/>
           <w:b w:val="0"/>
+          <w:color w:val="000000"/>
           <w:sz w:val="22"/>
           <w:rtl w:val="1"/>
           <w:szCs w:val="22"/>
@@ -582,6 +638,7 @@
         <w:rPr>
           <w:rFonts w:ascii="Cairo" w:hAnsi="Cairo" w:cs="Cairo" w:eastAsia="Tahoma"/>
           <w:b w:val="0"/>
+          <w:color w:val="000000"/>
           <w:sz w:val="22"/>
           <w:rtl w:val="1"/>
           <w:szCs w:val="22"/>
@@ -599,6 +656,7 @@
         <w:rPr>
           <w:rFonts w:ascii="Cairo" w:hAnsi="Cairo" w:cs="Cairo" w:eastAsia="Tahoma"/>
           <w:b w:val="0"/>
+          <w:color w:val="000000"/>
           <w:sz w:val="22"/>
           <w:rtl w:val="1"/>
           <w:szCs w:val="22"/>
@@ -620,6 +678,7 @@
         <w:rPr>
           <w:rFonts w:ascii="Cairo" w:hAnsi="Cairo" w:cs="Cairo" w:eastAsia="Tahoma"/>
           <w:b w:val="0"/>
+          <w:color w:val="000000"/>
           <w:sz w:val="22"/>
           <w:rtl w:val="1"/>
           <w:szCs w:val="22"/>
@@ -641,6 +700,7 @@
         <w:rPr>
           <w:rFonts w:ascii="Cairo" w:hAnsi="Cairo" w:cs="Cairo" w:eastAsia="Tahoma"/>
           <w:b w:val="0"/>
+          <w:color w:val="000000"/>
           <w:sz w:val="22"/>
           <w:rtl w:val="1"/>
           <w:szCs w:val="22"/>
@@ -662,6 +722,7 @@
         <w:rPr>
           <w:rFonts w:ascii="Cairo" w:hAnsi="Cairo" w:cs="Cairo" w:eastAsia="Tahoma"/>
           <w:b w:val="0"/>
+          <w:color w:val="000000"/>
           <w:sz w:val="22"/>
           <w:rtl w:val="1"/>
           <w:szCs w:val="22"/>
@@ -683,6 +744,7 @@
         <w:rPr>
           <w:rFonts w:ascii="Cairo" w:hAnsi="Cairo" w:cs="Cairo" w:eastAsia="Tahoma"/>
           <w:b w:val="0"/>
+          <w:color w:val="000000"/>
           <w:sz w:val="22"/>
           <w:rtl w:val="1"/>
           <w:szCs w:val="22"/>
@@ -692,7 +754,13 @@
     </w:p>
     <w:p>
       <w:pPr>
-        <w:spacing w:before="280" w:after="80" w:line="336" w:lineRule="auto"/>
+        <w:bidi w:val="1"/>
+        <w:spacing w:after="0" w:before="0"/>
+      </w:pPr>
+    </w:p>
+    <w:p>
+      <w:pPr>
+        <w:spacing w:before="160" w:after="80" w:line="336" w:lineRule="auto"/>
         <w:jc w:val="right"/>
         <w:bidi w:val="1"/>
       </w:pPr>
@@ -700,10 +768,10 @@
         <w:rPr>
           <w:rFonts w:ascii="Cairo" w:hAnsi="Cairo" w:cs="Cairo" w:eastAsia="Tahoma"/>
           <w:b/>
-          <w:color w:val="16366F"/>
-          <w:sz w:val="28"/>
+          <w:color w:val="000000"/>
+          <w:sz w:val="26"/>
           <w:rtl w:val="1"/>
-          <w:szCs w:val="28"/>
+          <w:szCs w:val="26"/>
         </w:rPr>
         <w:t>8. الرواتب والمدفوعات</w:t>
       </w:r>
@@ -722,6 +790,7 @@
         <w:rPr>
           <w:rFonts w:ascii="Cairo" w:hAnsi="Cairo" w:cs="Cairo" w:eastAsia="Tahoma"/>
           <w:b w:val="0"/>
+          <w:color w:val="000000"/>
           <w:sz w:val="22"/>
           <w:rtl w:val="1"/>
           <w:szCs w:val="22"/>
@@ -743,6 +812,7 @@
         <w:rPr>
           <w:rFonts w:ascii="Cairo" w:hAnsi="Cairo" w:cs="Cairo" w:eastAsia="Tahoma"/>
           <w:b w:val="0"/>
+          <w:color w:val="000000"/>
           <w:sz w:val="22"/>
           <w:rtl w:val="1"/>
           <w:szCs w:val="22"/>
@@ -764,6 +834,7 @@
         <w:rPr>
           <w:rFonts w:ascii="Cairo" w:hAnsi="Cairo" w:cs="Cairo" w:eastAsia="Tahoma"/>
           <w:b w:val="0"/>
+          <w:color w:val="000000"/>
           <w:sz w:val="22"/>
           <w:rtl w:val="1"/>
           <w:szCs w:val="22"/>
@@ -773,7 +844,13 @@
     </w:p>
     <w:p>
       <w:pPr>
-        <w:spacing w:before="280" w:after="80" w:line="336" w:lineRule="auto"/>
+        <w:bidi w:val="1"/>
+        <w:spacing w:after="0" w:before="0"/>
+      </w:pPr>
+    </w:p>
+    <w:p>
+      <w:pPr>
+        <w:spacing w:before="160" w:after="80" w:line="336" w:lineRule="auto"/>
         <w:jc w:val="right"/>
         <w:bidi w:val="1"/>
       </w:pPr>
@@ -781,10 +858,10 @@
         <w:rPr>
           <w:rFonts w:ascii="Cairo" w:hAnsi="Cairo" w:cs="Cairo" w:eastAsia="Tahoma"/>
           <w:b/>
-          <w:color w:val="16366F"/>
-          <w:sz w:val="28"/>
+          <w:color w:val="000000"/>
+          <w:sz w:val="26"/>
           <w:rtl w:val="1"/>
-          <w:szCs w:val="28"/>
+          <w:szCs w:val="26"/>
         </w:rPr>
         <w:t>9. الإشعارات</w:t>
       </w:r>
@@ -799,6 +876,7 @@
         <w:rPr>
           <w:rFonts w:ascii="Cairo" w:hAnsi="Cairo" w:cs="Cairo" w:eastAsia="Tahoma"/>
           <w:b w:val="0"/>
+          <w:color w:val="000000"/>
           <w:sz w:val="22"/>
           <w:rtl w:val="1"/>
           <w:szCs w:val="22"/>
@@ -808,7 +886,13 @@
     </w:p>
     <w:p>
       <w:pPr>
-        <w:spacing w:before="280" w:after="80" w:line="336" w:lineRule="auto"/>
+        <w:bidi w:val="1"/>
+        <w:spacing w:after="0" w:before="0"/>
+      </w:pPr>
+    </w:p>
+    <w:p>
+      <w:pPr>
+        <w:spacing w:before="160" w:after="80" w:line="336" w:lineRule="auto"/>
         <w:jc w:val="right"/>
         <w:bidi w:val="1"/>
       </w:pPr>
@@ -816,10 +900,10 @@
         <w:rPr>
           <w:rFonts w:ascii="Cairo" w:hAnsi="Cairo" w:cs="Cairo" w:eastAsia="Tahoma"/>
           <w:b/>
-          <w:color w:val="16366F"/>
-          <w:sz w:val="28"/>
+          <w:color w:val="000000"/>
+          <w:sz w:val="26"/>
           <w:rtl w:val="1"/>
-          <w:szCs w:val="28"/>
+          <w:szCs w:val="26"/>
         </w:rPr>
         <w:t>10. الملكية الفكرية</w:t>
       </w:r>
@@ -834,6 +918,7 @@
         <w:rPr>
           <w:rFonts w:ascii="Cairo" w:hAnsi="Cairo" w:cs="Cairo" w:eastAsia="Tahoma"/>
           <w:b w:val="0"/>
+          <w:color w:val="000000"/>
           <w:sz w:val="22"/>
           <w:rtl w:val="1"/>
           <w:szCs w:val="22"/>
@@ -843,7 +928,13 @@
     </w:p>
     <w:p>
       <w:pPr>
-        <w:spacing w:before="280" w:after="80" w:line="336" w:lineRule="auto"/>
+        <w:bidi w:val="1"/>
+        <w:spacing w:after="0" w:before="0"/>
+      </w:pPr>
+    </w:p>
+    <w:p>
+      <w:pPr>
+        <w:spacing w:before="160" w:after="80" w:line="336" w:lineRule="auto"/>
         <w:jc w:val="right"/>
         <w:bidi w:val="1"/>
       </w:pPr>
@@ -851,10 +942,10 @@
         <w:rPr>
           <w:rFonts w:ascii="Cairo" w:hAnsi="Cairo" w:cs="Cairo" w:eastAsia="Tahoma"/>
           <w:b/>
-          <w:color w:val="16366F"/>
-          <w:sz w:val="28"/>
+          <w:color w:val="000000"/>
+          <w:sz w:val="26"/>
           <w:rtl w:val="1"/>
-          <w:szCs w:val="28"/>
+          <w:szCs w:val="26"/>
         </w:rPr>
         <w:t>11. بيانات صاحب العمل / العميل</w:t>
       </w:r>
@@ -873,6 +964,7 @@
         <w:rPr>
           <w:rFonts w:ascii="Cairo" w:hAnsi="Cairo" w:cs="Cairo" w:eastAsia="Tahoma"/>
           <w:b w:val="0"/>
+          <w:color w:val="000000"/>
           <w:sz w:val="22"/>
           <w:rtl w:val="1"/>
           <w:szCs w:val="22"/>
@@ -894,6 +986,7 @@
         <w:rPr>
           <w:rFonts w:ascii="Cairo" w:hAnsi="Cairo" w:cs="Cairo" w:eastAsia="Tahoma"/>
           <w:b w:val="0"/>
+          <w:color w:val="000000"/>
           <w:sz w:val="22"/>
           <w:rtl w:val="1"/>
           <w:szCs w:val="22"/>
@@ -915,6 +1008,7 @@
         <w:rPr>
           <w:rFonts w:ascii="Cairo" w:hAnsi="Cairo" w:cs="Cairo" w:eastAsia="Tahoma"/>
           <w:b w:val="0"/>
+          <w:color w:val="000000"/>
           <w:sz w:val="22"/>
           <w:rtl w:val="1"/>
           <w:szCs w:val="22"/>
@@ -924,7 +1018,13 @@
     </w:p>
     <w:p>
       <w:pPr>
-        <w:spacing w:before="280" w:after="80" w:line="336" w:lineRule="auto"/>
+        <w:bidi w:val="1"/>
+        <w:spacing w:after="0" w:before="0"/>
+      </w:pPr>
+    </w:p>
+    <w:p>
+      <w:pPr>
+        <w:spacing w:before="160" w:after="80" w:line="336" w:lineRule="auto"/>
         <w:jc w:val="right"/>
         <w:bidi w:val="1"/>
       </w:pPr>
@@ -932,10 +1032,10 @@
         <w:rPr>
           <w:rFonts w:ascii="Cairo" w:hAnsi="Cairo" w:cs="Cairo" w:eastAsia="Tahoma"/>
           <w:b/>
-          <w:color w:val="16366F"/>
-          <w:sz w:val="28"/>
+          <w:color w:val="000000"/>
+          <w:sz w:val="26"/>
           <w:rtl w:val="1"/>
-          <w:szCs w:val="28"/>
+          <w:szCs w:val="26"/>
         </w:rPr>
         <w:t>12. توافر الخدمة</w:t>
       </w:r>
@@ -950,6 +1050,7 @@
         <w:rPr>
           <w:rFonts w:ascii="Cairo" w:hAnsi="Cairo" w:cs="Cairo" w:eastAsia="Tahoma"/>
           <w:b w:val="0"/>
+          <w:color w:val="000000"/>
           <w:sz w:val="22"/>
           <w:rtl w:val="1"/>
           <w:szCs w:val="22"/>
@@ -959,7 +1060,13 @@
     </w:p>
     <w:p>
       <w:pPr>
-        <w:spacing w:before="280" w:after="80" w:line="336" w:lineRule="auto"/>
+        <w:bidi w:val="1"/>
+        <w:spacing w:after="0" w:before="0"/>
+      </w:pPr>
+    </w:p>
+    <w:p>
+      <w:pPr>
+        <w:spacing w:before="160" w:after="80" w:line="336" w:lineRule="auto"/>
         <w:jc w:val="right"/>
         <w:bidi w:val="1"/>
       </w:pPr>
@@ -967,10 +1074,10 @@
         <w:rPr>
           <w:rFonts w:ascii="Cairo" w:hAnsi="Cairo" w:cs="Cairo" w:eastAsia="Tahoma"/>
           <w:b/>
-          <w:color w:val="16366F"/>
-          <w:sz w:val="28"/>
+          <w:color w:val="000000"/>
+          <w:sz w:val="26"/>
           <w:rtl w:val="1"/>
-          <w:szCs w:val="28"/>
+          <w:szCs w:val="26"/>
         </w:rPr>
         <w:t>13. إخلاء المسؤولية</w:t>
       </w:r>
@@ -985,6 +1092,7 @@
         <w:rPr>
           <w:rFonts w:ascii="Cairo" w:hAnsi="Cairo" w:cs="Cairo" w:eastAsia="Tahoma"/>
           <w:b w:val="0"/>
+          <w:color w:val="000000"/>
           <w:sz w:val="22"/>
           <w:rtl w:val="1"/>
           <w:szCs w:val="22"/>
@@ -994,7 +1102,13 @@
     </w:p>
     <w:p>
       <w:pPr>
-        <w:spacing w:before="280" w:after="80" w:line="336" w:lineRule="auto"/>
+        <w:bidi w:val="1"/>
+        <w:spacing w:after="0" w:before="0"/>
+      </w:pPr>
+    </w:p>
+    <w:p>
+      <w:pPr>
+        <w:spacing w:before="160" w:after="80" w:line="336" w:lineRule="auto"/>
         <w:jc w:val="right"/>
         <w:bidi w:val="1"/>
       </w:pPr>
@@ -1002,10 +1116,10 @@
         <w:rPr>
           <w:rFonts w:ascii="Cairo" w:hAnsi="Cairo" w:cs="Cairo" w:eastAsia="Tahoma"/>
           <w:b/>
-          <w:color w:val="16366F"/>
-          <w:sz w:val="28"/>
+          <w:color w:val="000000"/>
+          <w:sz w:val="26"/>
           <w:rtl w:val="1"/>
-          <w:szCs w:val="28"/>
+          <w:szCs w:val="26"/>
         </w:rPr>
         <w:t>14. تحديد المسؤولية</w:t>
       </w:r>
@@ -1020,6 +1134,7 @@
         <w:rPr>
           <w:rFonts w:ascii="Cairo" w:hAnsi="Cairo" w:cs="Cairo" w:eastAsia="Tahoma"/>
           <w:b w:val="0"/>
+          <w:color w:val="000000"/>
           <w:sz w:val="22"/>
           <w:rtl w:val="1"/>
           <w:szCs w:val="22"/>
@@ -1029,7 +1144,13 @@
     </w:p>
     <w:p>
       <w:pPr>
-        <w:spacing w:before="280" w:after="80" w:line="336" w:lineRule="auto"/>
+        <w:bidi w:val="1"/>
+        <w:spacing w:after="0" w:before="0"/>
+      </w:pPr>
+    </w:p>
+    <w:p>
+      <w:pPr>
+        <w:spacing w:before="160" w:after="80" w:line="336" w:lineRule="auto"/>
         <w:jc w:val="right"/>
         <w:bidi w:val="1"/>
       </w:pPr>
@@ -1037,10 +1158,10 @@
         <w:rPr>
           <w:rFonts w:ascii="Cairo" w:hAnsi="Cairo" w:cs="Cairo" w:eastAsia="Tahoma"/>
           <w:b/>
-          <w:color w:val="16366F"/>
-          <w:sz w:val="28"/>
+          <w:color w:val="000000"/>
+          <w:sz w:val="26"/>
           <w:rtl w:val="1"/>
-          <w:szCs w:val="28"/>
+          <w:szCs w:val="26"/>
         </w:rPr>
         <w:t>15. التعويض</w:t>
       </w:r>
@@ -1055,6 +1176,7 @@
         <w:rPr>
           <w:rFonts w:ascii="Cairo" w:hAnsi="Cairo" w:cs="Cairo" w:eastAsia="Tahoma"/>
           <w:b w:val="0"/>
+          <w:color w:val="000000"/>
           <w:sz w:val="22"/>
           <w:rtl w:val="1"/>
           <w:szCs w:val="22"/>
@@ -1064,7 +1186,13 @@
     </w:p>
     <w:p>
       <w:pPr>
-        <w:spacing w:before="280" w:after="80" w:line="336" w:lineRule="auto"/>
+        <w:bidi w:val="1"/>
+        <w:spacing w:after="0" w:before="0"/>
+      </w:pPr>
+    </w:p>
+    <w:p>
+      <w:pPr>
+        <w:spacing w:before="160" w:after="80" w:line="336" w:lineRule="auto"/>
         <w:jc w:val="right"/>
         <w:bidi w:val="1"/>
       </w:pPr>
@@ -1072,10 +1200,10 @@
         <w:rPr>
           <w:rFonts w:ascii="Cairo" w:hAnsi="Cairo" w:cs="Cairo" w:eastAsia="Tahoma"/>
           <w:b/>
-          <w:color w:val="16366F"/>
-          <w:sz w:val="28"/>
+          <w:color w:val="000000"/>
+          <w:sz w:val="26"/>
           <w:rtl w:val="1"/>
-          <w:szCs w:val="28"/>
+          <w:szCs w:val="26"/>
         </w:rPr>
         <w:t>16. الإنهاء</w:t>
       </w:r>
@@ -1090,6 +1218,7 @@
         <w:rPr>
           <w:rFonts w:ascii="Cairo" w:hAnsi="Cairo" w:cs="Cairo" w:eastAsia="Tahoma"/>
           <w:b w:val="0"/>
+          <w:color w:val="000000"/>
           <w:sz w:val="22"/>
           <w:rtl w:val="1"/>
           <w:szCs w:val="22"/>
@@ -1099,7 +1228,13 @@
     </w:p>
     <w:p>
       <w:pPr>
-        <w:spacing w:before="280" w:after="80" w:line="336" w:lineRule="auto"/>
+        <w:bidi w:val="1"/>
+        <w:spacing w:after="0" w:before="0"/>
+      </w:pPr>
+    </w:p>
+    <w:p>
+      <w:pPr>
+        <w:spacing w:before="160" w:after="80" w:line="336" w:lineRule="auto"/>
         <w:jc w:val="right"/>
         <w:bidi w:val="1"/>
       </w:pPr>
@@ -1107,10 +1242,10 @@
         <w:rPr>
           <w:rFonts w:ascii="Cairo" w:hAnsi="Cairo" w:cs="Cairo" w:eastAsia="Tahoma"/>
           <w:b/>
-          <w:color w:val="16366F"/>
-          <w:sz w:val="28"/>
+          <w:color w:val="000000"/>
+          <w:sz w:val="26"/>
           <w:rtl w:val="1"/>
-          <w:szCs w:val="28"/>
+          <w:szCs w:val="26"/>
         </w:rPr>
         <w:t>17. تعديل الشروط</w:t>
       </w:r>
@@ -1125,6 +1260,7 @@
         <w:rPr>
           <w:rFonts w:ascii="Cairo" w:hAnsi="Cairo" w:cs="Cairo" w:eastAsia="Tahoma"/>
           <w:b w:val="0"/>
+          <w:color w:val="000000"/>
           <w:sz w:val="22"/>
           <w:rtl w:val="1"/>
           <w:szCs w:val="22"/>
@@ -1134,7 +1270,13 @@
     </w:p>
     <w:p>
       <w:pPr>
-        <w:spacing w:before="280" w:after="80" w:line="336" w:lineRule="auto"/>
+        <w:bidi w:val="1"/>
+        <w:spacing w:after="0" w:before="0"/>
+      </w:pPr>
+    </w:p>
+    <w:p>
+      <w:pPr>
+        <w:spacing w:before="160" w:after="80" w:line="336" w:lineRule="auto"/>
         <w:jc w:val="right"/>
         <w:bidi w:val="1"/>
       </w:pPr>
@@ -1142,10 +1284,10 @@
         <w:rPr>
           <w:rFonts w:ascii="Cairo" w:hAnsi="Cairo" w:cs="Cairo" w:eastAsia="Tahoma"/>
           <w:b/>
-          <w:color w:val="16366F"/>
-          <w:sz w:val="28"/>
+          <w:color w:val="000000"/>
+          <w:sz w:val="26"/>
           <w:rtl w:val="1"/>
-          <w:szCs w:val="28"/>
+          <w:szCs w:val="26"/>
         </w:rPr>
         <w:t>18. النظام الحاكم والاختصاص القضائي</w:t>
       </w:r>
@@ -1160,6 +1302,7 @@
         <w:rPr>
           <w:rFonts w:ascii="Cairo" w:hAnsi="Cairo" w:cs="Cairo" w:eastAsia="Tahoma"/>
           <w:b w:val="0"/>
+          <w:color w:val="000000"/>
           <w:sz w:val="22"/>
           <w:rtl w:val="1"/>
           <w:szCs w:val="22"/>
@@ -1169,7 +1312,13 @@
     </w:p>
     <w:p>
       <w:pPr>
-        <w:spacing w:before="280" w:after="80" w:line="336" w:lineRule="auto"/>
+        <w:bidi w:val="1"/>
+        <w:spacing w:after="0" w:before="0"/>
+      </w:pPr>
+    </w:p>
+    <w:p>
+      <w:pPr>
+        <w:spacing w:before="160" w:after="80" w:line="336" w:lineRule="auto"/>
         <w:jc w:val="right"/>
         <w:bidi w:val="1"/>
       </w:pPr>
@@ -1177,28 +1326,28 @@
         <w:rPr>
           <w:rFonts w:ascii="Cairo" w:hAnsi="Cairo" w:cs="Cairo" w:eastAsia="Tahoma"/>
           <w:b/>
-          <w:color w:val="16366F"/>
-          <w:sz w:val="28"/>
+          <w:color w:val="000000"/>
+          <w:sz w:val="26"/>
           <w:rtl w:val="1"/>
-          <w:szCs w:val="28"/>
+          <w:szCs w:val="26"/>
         </w:rPr>
         <w:t>19. التواصل</w:t>
       </w:r>
     </w:p>
     <w:p>
       <w:pPr>
-        <w:spacing w:before="0" w:after="80" w:line="336" w:lineRule="auto"/>
+        <w:spacing w:before="0" w:after="40" w:line="336" w:lineRule="auto"/>
         <w:jc w:val="center"/>
         <w:bidi w:val="1"/>
       </w:pPr>
       <w:r>
         <w:rPr>
           <w:rFonts w:ascii="Cairo" w:hAnsi="Cairo" w:cs="Cairo" w:eastAsia="Tahoma"/>
-          <w:b/>
-          <w:color w:val="4B5563"/>
-          <w:sz w:val="24"/>
+          <w:b w:val="0"/>
+          <w:color w:val="000000"/>
+          <w:sz w:val="22"/>
           <w:rtl w:val="1"/>
-          <w:szCs w:val="24"/>
+          <w:szCs w:val="22"/>
         </w:rPr>
         <w:t>شركة العربة الفاخرة (Luxury Cart Company)</w:t>
       </w:r>
@@ -1213,6 +1362,7 @@
         <w:rPr>
           <w:rFonts w:ascii="Cairo" w:hAnsi="Cairo" w:cs="Cairo" w:eastAsia="Tahoma"/>
           <w:b w:val="0"/>
+          <w:color w:val="000000"/>
           <w:sz w:val="22"/>
           <w:rtl w:val="1"/>
           <w:szCs w:val="22"/>
@@ -1230,6 +1380,7 @@
         <w:rPr>
           <w:rFonts w:ascii="Cairo" w:hAnsi="Cairo" w:cs="Cairo" w:eastAsia="Tahoma"/>
           <w:b w:val="0"/>
+          <w:color w:val="000000"/>
           <w:sz w:val="22"/>
           <w:rtl w:val="1"/>
           <w:szCs w:val="22"/>
@@ -1644,6 +1795,11 @@
     <w:name w:val="Normal"/>
     <w:qFormat/>
     <w:rsid w:val="00FC693F"/>
+    <w:rPr>
+      <w:rFonts w:ascii="Cairo" w:hAnsi="Cairo"/>
+      <w:color w:val="000000"/>
+      <w:sz w:val="22"/>
+    </w:rPr>
   </w:style>
   <w:style w:type="paragraph" w:styleId="Header">
     <w:name w:val="header"/>

</xml_diff>